<commit_message>
Synchronize project documents and remove temporary files
</commit_message>
<xml_diff>
--- a/IOT project document.docx
+++ b/IOT project document.docx
@@ -9566,6 +9566,370 @@
         </w:rPr>
       </w:pPr>
     </w:p>
+    <w:p>
+      <w:pPr>
+        <w:rPr>
+          <w:rFonts w:ascii="Times New Roman" w:hAnsi="Times New Roman" w:cs="Times New Roman"/>
+          <w:sz w:val="28"/>
+          <w:szCs w:val="28"/>
+        </w:rPr>
+      </w:pPr>
+    </w:p>
+    <w:p>
+      <w:pPr>
+        <w:rPr>
+          <w:rFonts w:ascii="Times New Roman" w:hAnsi="Times New Roman" w:cs="Times New Roman"/>
+          <w:sz w:val="28"/>
+          <w:szCs w:val="28"/>
+        </w:rPr>
+      </w:pPr>
+    </w:p>
+    <w:p>
+      <w:pPr>
+        <w:rPr>
+          <w:rFonts w:ascii="Times New Roman" w:hAnsi="Times New Roman" w:cs="Times New Roman"/>
+          <w:sz w:val="28"/>
+          <w:szCs w:val="28"/>
+        </w:rPr>
+      </w:pPr>
+    </w:p>
+    <w:p>
+      <w:pPr>
+        <w:rPr>
+          <w:rFonts w:ascii="Times New Roman" w:hAnsi="Times New Roman" w:cs="Times New Roman"/>
+          <w:sz w:val="28"/>
+          <w:szCs w:val="28"/>
+        </w:rPr>
+      </w:pPr>
+    </w:p>
+    <w:p>
+      <w:pPr>
+        <w:rPr>
+          <w:rFonts w:ascii="Times New Roman" w:hAnsi="Times New Roman" w:cs="Times New Roman"/>
+          <w:sz w:val="28"/>
+          <w:szCs w:val="28"/>
+        </w:rPr>
+      </w:pPr>
+    </w:p>
+    <w:p>
+      <w:pPr>
+        <w:rPr>
+          <w:rFonts w:ascii="Times New Roman" w:hAnsi="Times New Roman" w:cs="Times New Roman"/>
+          <w:sz w:val="28"/>
+          <w:szCs w:val="28"/>
+        </w:rPr>
+      </w:pPr>
+    </w:p>
+    <w:p>
+      <w:pPr>
+        <w:rPr>
+          <w:rFonts w:ascii="Times New Roman" w:hAnsi="Times New Roman" w:cs="Times New Roman"/>
+          <w:sz w:val="28"/>
+          <w:szCs w:val="28"/>
+        </w:rPr>
+      </w:pPr>
+    </w:p>
+    <w:p>
+      <w:pPr>
+        <w:rPr>
+          <w:rFonts w:ascii="Times New Roman" w:hAnsi="Times New Roman" w:cs="Times New Roman"/>
+          <w:sz w:val="28"/>
+          <w:szCs w:val="28"/>
+        </w:rPr>
+      </w:pPr>
+    </w:p>
+    <w:p>
+      <w:pPr>
+        <w:rPr>
+          <w:rFonts w:ascii="Times New Roman" w:hAnsi="Times New Roman" w:cs="Times New Roman"/>
+          <w:sz w:val="28"/>
+          <w:szCs w:val="28"/>
+        </w:rPr>
+      </w:pPr>
+    </w:p>
+    <w:p>
+      <w:pPr>
+        <w:rPr>
+          <w:rFonts w:ascii="Times New Roman" w:hAnsi="Times New Roman" w:cs="Times New Roman"/>
+          <w:sz w:val="28"/>
+          <w:szCs w:val="28"/>
+        </w:rPr>
+      </w:pPr>
+    </w:p>
+    <w:p>
+      <w:pPr>
+        <w:rPr>
+          <w:rFonts w:ascii="Times New Roman" w:hAnsi="Times New Roman" w:cs="Times New Roman"/>
+          <w:sz w:val="28"/>
+          <w:szCs w:val="28"/>
+        </w:rPr>
+      </w:pPr>
+    </w:p>
+    <w:p>
+      <w:pPr>
+        <w:rPr>
+          <w:rFonts w:ascii="Times New Roman" w:hAnsi="Times New Roman" w:cs="Times New Roman"/>
+          <w:sz w:val="28"/>
+          <w:szCs w:val="28"/>
+        </w:rPr>
+      </w:pPr>
+    </w:p>
+    <w:p>
+      <w:pPr>
+        <w:rPr>
+          <w:rFonts w:ascii="Times New Roman" w:hAnsi="Times New Roman" w:cs="Times New Roman"/>
+          <w:sz w:val="28"/>
+          <w:szCs w:val="28"/>
+        </w:rPr>
+      </w:pPr>
+    </w:p>
+    <w:p>
+      <w:pPr>
+        <w:rPr>
+          <w:rFonts w:ascii="Times New Roman" w:hAnsi="Times New Roman" w:cs="Times New Roman"/>
+          <w:sz w:val="28"/>
+          <w:szCs w:val="28"/>
+        </w:rPr>
+      </w:pPr>
+    </w:p>
+    <w:p>
+      <w:pPr>
+        <w:rPr>
+          <w:rFonts w:ascii="Times New Roman" w:hAnsi="Times New Roman" w:cs="Times New Roman"/>
+          <w:sz w:val="28"/>
+          <w:szCs w:val="28"/>
+        </w:rPr>
+      </w:pPr>
+    </w:p>
+    <w:p>
+      <w:pPr>
+        <w:rPr>
+          <w:rFonts w:ascii="Times New Roman" w:hAnsi="Times New Roman" w:cs="Times New Roman"/>
+          <w:sz w:val="28"/>
+          <w:szCs w:val="28"/>
+        </w:rPr>
+      </w:pPr>
+    </w:p>
+    <w:p>
+      <w:pPr>
+        <w:rPr>
+          <w:rFonts w:ascii="Times New Roman" w:hAnsi="Times New Roman" w:cs="Times New Roman"/>
+          <w:sz w:val="28"/>
+          <w:szCs w:val="28"/>
+        </w:rPr>
+      </w:pPr>
+    </w:p>
+    <w:p>
+      <w:pPr>
+        <w:rPr>
+          <w:rFonts w:ascii="Times New Roman" w:hAnsi="Times New Roman" w:cs="Times New Roman"/>
+          <w:sz w:val="28"/>
+          <w:szCs w:val="28"/>
+        </w:rPr>
+      </w:pPr>
+    </w:p>
+    <w:p>
+      <w:pPr>
+        <w:rPr>
+          <w:rFonts w:ascii="Times New Roman" w:hAnsi="Times New Roman" w:cs="Times New Roman"/>
+          <w:sz w:val="28"/>
+          <w:szCs w:val="28"/>
+        </w:rPr>
+      </w:pPr>
+    </w:p>
+    <w:p>
+      <w:pPr>
+        <w:rPr>
+          <w:rFonts w:ascii="Times New Roman" w:hAnsi="Times New Roman" w:cs="Times New Roman"/>
+          <w:b/>
+          <w:bCs/>
+          <w:sz w:val="40"/>
+          <w:szCs w:val="40"/>
+        </w:rPr>
+      </w:pPr>
+      <w:r>
+        <w:rPr>
+          <w:rFonts w:ascii="Times New Roman" w:hAnsi="Times New Roman" w:cs="Times New Roman"/>
+          <w:b/>
+          <w:bCs/>
+          <w:sz w:val="40"/>
+          <w:szCs w:val="40"/>
+        </w:rPr>
+        <w:lastRenderedPageBreak/>
+        <w:t>10</w:t>
+      </w:r>
+      <w:r>
+        <w:rPr>
+          <w:rFonts w:ascii="Times New Roman" w:hAnsi="Times New Roman" w:cs="Times New Roman"/>
+          <w:b/>
+          <w:bCs/>
+          <w:sz w:val="40"/>
+          <w:szCs w:val="40"/>
+        </w:rPr>
+        <w:t xml:space="preserve">. </w:t>
+      </w:r>
+      <w:r>
+        <w:rPr>
+          <w:rFonts w:ascii="Times New Roman" w:hAnsi="Times New Roman" w:cs="Times New Roman"/>
+          <w:b/>
+          <w:bCs/>
+          <w:sz w:val="40"/>
+          <w:szCs w:val="40"/>
+        </w:rPr>
+        <w:t xml:space="preserve">APPLICATION </w:t>
+      </w:r>
+    </w:p>
+    <w:p>
+      <w:pPr>
+        <w:rPr>
+          <w:rFonts w:ascii="Times New Roman" w:hAnsi="Times New Roman" w:cs="Times New Roman"/>
+          <w:b/>
+          <w:bCs/>
+          <w:sz w:val="28"/>
+          <w:szCs w:val="28"/>
+        </w:rPr>
+      </w:pPr>
+    </w:p>
+    <w:p>
+      <w:pPr>
+        <w:numPr>
+          <w:ilvl w:val="0"/>
+          <w:numId w:val="10"/>
+        </w:numPr>
+        <w:rPr>
+          <w:rFonts w:ascii="Times New Roman" w:hAnsi="Times New Roman" w:cs="Times New Roman"/>
+          <w:sz w:val="28"/>
+          <w:szCs w:val="28"/>
+        </w:rPr>
+      </w:pPr>
+      <w:r>
+        <w:rPr>
+          <w:rFonts w:ascii="Times New Roman" w:hAnsi="Times New Roman" w:cs="Times New Roman"/>
+          <w:b/>
+          <w:bCs/>
+          <w:sz w:val="28"/>
+          <w:szCs w:val="28"/>
+        </w:rPr>
+        <w:t>Main Repository</w:t>
+      </w:r>
+      <w:r>
+        <w:rPr>
+          <w:rFonts w:ascii="Times New Roman" w:hAnsi="Times New Roman" w:cs="Times New Roman"/>
+          <w:sz w:val="28"/>
+          <w:szCs w:val="28"/>
+        </w:rPr>
+        <w:t>: </w:t>
+      </w:r>
+      <w:hyperlink r:id="rId11" w:history="1">
+        <w:r>
+          <w:rPr>
+            <w:rStyle w:val="Hyperlink"/>
+            <w:rFonts w:ascii="Times New Roman" w:hAnsi="Times New Roman" w:cs="Times New Roman"/>
+            <w:sz w:val="28"/>
+            <w:szCs w:val="28"/>
+          </w:rPr>
+          <w:t>github.com/vijay</w:t>
+        </w:r>
+        <w:r>
+          <w:rPr>
+            <w:rStyle w:val="Hyperlink"/>
+            <w:rFonts w:ascii="Times New Roman" w:hAnsi="Times New Roman" w:cs="Times New Roman"/>
+            <w:sz w:val="28"/>
+            <w:szCs w:val="28"/>
+          </w:rPr>
+          <w:t>m</w:t>
+        </w:r>
+        <w:r>
+          <w:rPr>
+            <w:rStyle w:val="Hyperlink"/>
+            <w:rFonts w:ascii="Times New Roman" w:hAnsi="Times New Roman" w:cs="Times New Roman"/>
+            <w:sz w:val="28"/>
+            <w:szCs w:val="28"/>
+          </w:rPr>
+          <w:t>ahes9080/</w:t>
+        </w:r>
+        <w:proofErr w:type="spellStart"/>
+        <w:r>
+          <w:rPr>
+            <w:rStyle w:val="Hyperlink"/>
+            <w:rFonts w:ascii="Times New Roman" w:hAnsi="Times New Roman" w:cs="Times New Roman"/>
+            <w:sz w:val="28"/>
+            <w:szCs w:val="28"/>
+          </w:rPr>
+          <w:t>IOT_application</w:t>
+        </w:r>
+        <w:proofErr w:type="spellEnd"/>
+      </w:hyperlink>
+    </w:p>
+    <w:p>
+      <w:pPr>
+        <w:numPr>
+          <w:ilvl w:val="0"/>
+          <w:numId w:val="10"/>
+        </w:numPr>
+        <w:rPr>
+          <w:rFonts w:ascii="Times New Roman" w:hAnsi="Times New Roman" w:cs="Times New Roman"/>
+          <w:sz w:val="28"/>
+          <w:szCs w:val="28"/>
+        </w:rPr>
+      </w:pPr>
+      <w:r>
+        <w:rPr>
+          <w:rFonts w:ascii="Times New Roman" w:hAnsi="Times New Roman" w:cs="Times New Roman"/>
+          <w:b/>
+          <w:bCs/>
+          <w:sz w:val="28"/>
+          <w:szCs w:val="28"/>
+        </w:rPr>
+        <w:t>Hosted Frontend</w:t>
+      </w:r>
+      <w:r>
+        <w:rPr>
+          <w:rFonts w:ascii="Times New Roman" w:hAnsi="Times New Roman" w:cs="Times New Roman"/>
+          <w:sz w:val="28"/>
+          <w:szCs w:val="28"/>
+        </w:rPr>
+        <w:t>: </w:t>
+      </w:r>
+      <w:hyperlink r:id="rId12" w:history="1">
+        <w:r>
+          <w:rPr>
+            <w:rStyle w:val="Hyperlink"/>
+            <w:rFonts w:ascii="Times New Roman" w:hAnsi="Times New Roman" w:cs="Times New Roman"/>
+            <w:sz w:val="28"/>
+            <w:szCs w:val="28"/>
+          </w:rPr>
+          <w:t xml:space="preserve">Orbit-X </w:t>
+        </w:r>
+        <w:r>
+          <w:rPr>
+            <w:rStyle w:val="Hyperlink"/>
+            <w:rFonts w:ascii="Times New Roman" w:hAnsi="Times New Roman" w:cs="Times New Roman"/>
+            <w:sz w:val="28"/>
+            <w:szCs w:val="28"/>
+          </w:rPr>
+          <w:t>W</w:t>
+        </w:r>
+        <w:r>
+          <w:rPr>
+            <w:rStyle w:val="Hyperlink"/>
+            <w:rFonts w:ascii="Times New Roman" w:hAnsi="Times New Roman" w:cs="Times New Roman"/>
+            <w:sz w:val="28"/>
+            <w:szCs w:val="28"/>
+          </w:rPr>
+          <w:t>eb Hub</w:t>
+        </w:r>
+      </w:hyperlink>
+    </w:p>
+    <w:p>
+      <w:pPr>
+        <w:rPr>
+          <w:rFonts w:ascii="Times New Roman" w:hAnsi="Times New Roman" w:cs="Times New Roman"/>
+          <w:sz w:val="28"/>
+          <w:szCs w:val="28"/>
+        </w:rPr>
+      </w:pPr>
+    </w:p>
     <w:sectPr>
       <w:pgSz w:w="11906" w:h="16838"/>
       <w:pgMar w:top="1440" w:right="1440" w:bottom="1440" w:left="1440" w:header="708" w:footer="708" w:gutter="0"/>
@@ -10008,6 +10372,119 @@
     </w:lvl>
   </w:abstractNum>
   <w:abstractNum w:abstractNumId="4" w15:restartNumberingAfterBreak="0">
+    <w:nsid w:val="3EB858BE"/>
+    <w:multiLevelType w:val="multilevel"/>
+    <w:tmpl w:val="52E81834"/>
+    <w:lvl w:ilvl="0">
+      <w:start w:val="1"/>
+      <w:numFmt w:val="decimal"/>
+      <w:lvlText w:val="%1."/>
+      <w:lvlJc w:val="left"/>
+      <w:pPr>
+        <w:tabs>
+          <w:tab w:val="num" w:pos="720"/>
+        </w:tabs>
+        <w:ind w:left="720" w:hanging="360"/>
+      </w:pPr>
+    </w:lvl>
+    <w:lvl w:ilvl="1" w:tentative="1">
+      <w:start w:val="1"/>
+      <w:numFmt w:val="decimal"/>
+      <w:lvlText w:val="%2."/>
+      <w:lvlJc w:val="left"/>
+      <w:pPr>
+        <w:tabs>
+          <w:tab w:val="num" w:pos="1440"/>
+        </w:tabs>
+        <w:ind w:left="1440" w:hanging="360"/>
+      </w:pPr>
+    </w:lvl>
+    <w:lvl w:ilvl="2" w:tentative="1">
+      <w:start w:val="1"/>
+      <w:numFmt w:val="decimal"/>
+      <w:lvlText w:val="%3."/>
+      <w:lvlJc w:val="left"/>
+      <w:pPr>
+        <w:tabs>
+          <w:tab w:val="num" w:pos="2160"/>
+        </w:tabs>
+        <w:ind w:left="2160" w:hanging="360"/>
+      </w:pPr>
+    </w:lvl>
+    <w:lvl w:ilvl="3" w:tentative="1">
+      <w:start w:val="1"/>
+      <w:numFmt w:val="decimal"/>
+      <w:lvlText w:val="%4."/>
+      <w:lvlJc w:val="left"/>
+      <w:pPr>
+        <w:tabs>
+          <w:tab w:val="num" w:pos="2880"/>
+        </w:tabs>
+        <w:ind w:left="2880" w:hanging="360"/>
+      </w:pPr>
+    </w:lvl>
+    <w:lvl w:ilvl="4" w:tentative="1">
+      <w:start w:val="1"/>
+      <w:numFmt w:val="decimal"/>
+      <w:lvlText w:val="%5."/>
+      <w:lvlJc w:val="left"/>
+      <w:pPr>
+        <w:tabs>
+          <w:tab w:val="num" w:pos="3600"/>
+        </w:tabs>
+        <w:ind w:left="3600" w:hanging="360"/>
+      </w:pPr>
+    </w:lvl>
+    <w:lvl w:ilvl="5" w:tentative="1">
+      <w:start w:val="1"/>
+      <w:numFmt w:val="decimal"/>
+      <w:lvlText w:val="%6."/>
+      <w:lvlJc w:val="left"/>
+      <w:pPr>
+        <w:tabs>
+          <w:tab w:val="num" w:pos="4320"/>
+        </w:tabs>
+        <w:ind w:left="4320" w:hanging="360"/>
+      </w:pPr>
+    </w:lvl>
+    <w:lvl w:ilvl="6" w:tentative="1">
+      <w:start w:val="1"/>
+      <w:numFmt w:val="decimal"/>
+      <w:lvlText w:val="%7."/>
+      <w:lvlJc w:val="left"/>
+      <w:pPr>
+        <w:tabs>
+          <w:tab w:val="num" w:pos="5040"/>
+        </w:tabs>
+        <w:ind w:left="5040" w:hanging="360"/>
+      </w:pPr>
+    </w:lvl>
+    <w:lvl w:ilvl="7" w:tentative="1">
+      <w:start w:val="1"/>
+      <w:numFmt w:val="decimal"/>
+      <w:lvlText w:val="%8."/>
+      <w:lvlJc w:val="left"/>
+      <w:pPr>
+        <w:tabs>
+          <w:tab w:val="num" w:pos="5760"/>
+        </w:tabs>
+        <w:ind w:left="5760" w:hanging="360"/>
+      </w:pPr>
+    </w:lvl>
+    <w:lvl w:ilvl="8" w:tentative="1">
+      <w:start w:val="1"/>
+      <w:numFmt w:val="decimal"/>
+      <w:lvlText w:val="%9."/>
+      <w:lvlJc w:val="left"/>
+      <w:pPr>
+        <w:tabs>
+          <w:tab w:val="num" w:pos="6480"/>
+        </w:tabs>
+        <w:ind w:left="6480" w:hanging="360"/>
+      </w:pPr>
+    </w:lvl>
+  </w:abstractNum>
+  <w:abstractNum w:abstractNumId="5" w15:restartNumberingAfterBreak="0">
     <w:nsid w:val="44652517"/>
     <w:multiLevelType w:val="multilevel"/>
     <w:tmpl w:val="52E81834"/>
@@ -10120,7 +10597,7 @@
       </w:pPr>
     </w:lvl>
   </w:abstractNum>
-  <w:abstractNum w:abstractNumId="5" w15:restartNumberingAfterBreak="0">
+  <w:abstractNum w:abstractNumId="6" w15:restartNumberingAfterBreak="0">
     <w:nsid w:val="4C824ABE"/>
     <w:multiLevelType w:val="hybridMultilevel"/>
     <w:tmpl w:val="6EBE0866"/>
@@ -10210,7 +10687,7 @@
       </w:pPr>
     </w:lvl>
   </w:abstractNum>
-  <w:abstractNum w:abstractNumId="6" w15:restartNumberingAfterBreak="0">
+  <w:abstractNum w:abstractNumId="7" w15:restartNumberingAfterBreak="0">
     <w:nsid w:val="50964EA7"/>
     <w:multiLevelType w:val="multilevel"/>
     <w:tmpl w:val="28D86532"/>
@@ -10359,10 +10836,10 @@
       </w:rPr>
     </w:lvl>
   </w:abstractNum>
-  <w:abstractNum w:abstractNumId="7" w15:restartNumberingAfterBreak="0">
-    <w:nsid w:val="6E050829"/>
+  <w:abstractNum w:abstractNumId="8" w15:restartNumberingAfterBreak="0">
+    <w:nsid w:val="5EBB7130"/>
     <w:multiLevelType w:val="multilevel"/>
-    <w:tmpl w:val="9D1CA414"/>
+    <w:tmpl w:val="1AE40C3A"/>
     <w:lvl w:ilvl="0">
       <w:start w:val="1"/>
       <w:numFmt w:val="bullet"/>
@@ -10508,14 +10985,163 @@
       </w:rPr>
     </w:lvl>
   </w:abstractNum>
+  <w:abstractNum w:abstractNumId="9" w15:restartNumberingAfterBreak="0">
+    <w:nsid w:val="6E050829"/>
+    <w:multiLevelType w:val="multilevel"/>
+    <w:tmpl w:val="9D1CA414"/>
+    <w:lvl w:ilvl="0">
+      <w:start w:val="1"/>
+      <w:numFmt w:val="bullet"/>
+      <w:lvlText w:val=""/>
+      <w:lvlJc w:val="left"/>
+      <w:pPr>
+        <w:tabs>
+          <w:tab w:val="num" w:pos="720"/>
+        </w:tabs>
+        <w:ind w:left="720" w:hanging="360"/>
+      </w:pPr>
+      <w:rPr>
+        <w:rFonts w:ascii="Symbol" w:hAnsi="Symbol" w:hint="default"/>
+        <w:sz w:val="20"/>
+      </w:rPr>
+    </w:lvl>
+    <w:lvl w:ilvl="1" w:tentative="1">
+      <w:start w:val="1"/>
+      <w:numFmt w:val="bullet"/>
+      <w:lvlText w:val="o"/>
+      <w:lvlJc w:val="left"/>
+      <w:pPr>
+        <w:tabs>
+          <w:tab w:val="num" w:pos="1440"/>
+        </w:tabs>
+        <w:ind w:left="1440" w:hanging="360"/>
+      </w:pPr>
+      <w:rPr>
+        <w:rFonts w:ascii="Courier New" w:hAnsi="Courier New" w:hint="default"/>
+        <w:sz w:val="20"/>
+      </w:rPr>
+    </w:lvl>
+    <w:lvl w:ilvl="2" w:tentative="1">
+      <w:start w:val="1"/>
+      <w:numFmt w:val="bullet"/>
+      <w:lvlText w:val=""/>
+      <w:lvlJc w:val="left"/>
+      <w:pPr>
+        <w:tabs>
+          <w:tab w:val="num" w:pos="2160"/>
+        </w:tabs>
+        <w:ind w:left="2160" w:hanging="360"/>
+      </w:pPr>
+      <w:rPr>
+        <w:rFonts w:ascii="Wingdings" w:hAnsi="Wingdings" w:hint="default"/>
+        <w:sz w:val="20"/>
+      </w:rPr>
+    </w:lvl>
+    <w:lvl w:ilvl="3" w:tentative="1">
+      <w:start w:val="1"/>
+      <w:numFmt w:val="bullet"/>
+      <w:lvlText w:val=""/>
+      <w:lvlJc w:val="left"/>
+      <w:pPr>
+        <w:tabs>
+          <w:tab w:val="num" w:pos="2880"/>
+        </w:tabs>
+        <w:ind w:left="2880" w:hanging="360"/>
+      </w:pPr>
+      <w:rPr>
+        <w:rFonts w:ascii="Wingdings" w:hAnsi="Wingdings" w:hint="default"/>
+        <w:sz w:val="20"/>
+      </w:rPr>
+    </w:lvl>
+    <w:lvl w:ilvl="4" w:tentative="1">
+      <w:start w:val="1"/>
+      <w:numFmt w:val="bullet"/>
+      <w:lvlText w:val=""/>
+      <w:lvlJc w:val="left"/>
+      <w:pPr>
+        <w:tabs>
+          <w:tab w:val="num" w:pos="3600"/>
+        </w:tabs>
+        <w:ind w:left="3600" w:hanging="360"/>
+      </w:pPr>
+      <w:rPr>
+        <w:rFonts w:ascii="Wingdings" w:hAnsi="Wingdings" w:hint="default"/>
+        <w:sz w:val="20"/>
+      </w:rPr>
+    </w:lvl>
+    <w:lvl w:ilvl="5" w:tentative="1">
+      <w:start w:val="1"/>
+      <w:numFmt w:val="bullet"/>
+      <w:lvlText w:val=""/>
+      <w:lvlJc w:val="left"/>
+      <w:pPr>
+        <w:tabs>
+          <w:tab w:val="num" w:pos="4320"/>
+        </w:tabs>
+        <w:ind w:left="4320" w:hanging="360"/>
+      </w:pPr>
+      <w:rPr>
+        <w:rFonts w:ascii="Wingdings" w:hAnsi="Wingdings" w:hint="default"/>
+        <w:sz w:val="20"/>
+      </w:rPr>
+    </w:lvl>
+    <w:lvl w:ilvl="6" w:tentative="1">
+      <w:start w:val="1"/>
+      <w:numFmt w:val="bullet"/>
+      <w:lvlText w:val=""/>
+      <w:lvlJc w:val="left"/>
+      <w:pPr>
+        <w:tabs>
+          <w:tab w:val="num" w:pos="5040"/>
+        </w:tabs>
+        <w:ind w:left="5040" w:hanging="360"/>
+      </w:pPr>
+      <w:rPr>
+        <w:rFonts w:ascii="Wingdings" w:hAnsi="Wingdings" w:hint="default"/>
+        <w:sz w:val="20"/>
+      </w:rPr>
+    </w:lvl>
+    <w:lvl w:ilvl="7" w:tentative="1">
+      <w:start w:val="1"/>
+      <w:numFmt w:val="bullet"/>
+      <w:lvlText w:val=""/>
+      <w:lvlJc w:val="left"/>
+      <w:pPr>
+        <w:tabs>
+          <w:tab w:val="num" w:pos="5760"/>
+        </w:tabs>
+        <w:ind w:left="5760" w:hanging="360"/>
+      </w:pPr>
+      <w:rPr>
+        <w:rFonts w:ascii="Wingdings" w:hAnsi="Wingdings" w:hint="default"/>
+        <w:sz w:val="20"/>
+      </w:rPr>
+    </w:lvl>
+    <w:lvl w:ilvl="8" w:tentative="1">
+      <w:start w:val="1"/>
+      <w:numFmt w:val="bullet"/>
+      <w:lvlText w:val=""/>
+      <w:lvlJc w:val="left"/>
+      <w:pPr>
+        <w:tabs>
+          <w:tab w:val="num" w:pos="6480"/>
+        </w:tabs>
+        <w:ind w:left="6480" w:hanging="360"/>
+      </w:pPr>
+      <w:rPr>
+        <w:rFonts w:ascii="Wingdings" w:hAnsi="Wingdings" w:hint="default"/>
+        <w:sz w:val="20"/>
+      </w:rPr>
+    </w:lvl>
+  </w:abstractNum>
   <w:num w:numId="1" w16cid:durableId="790514469">
     <w:abstractNumId w:val="0"/>
   </w:num>
   <w:num w:numId="2" w16cid:durableId="1486892007">
-    <w:abstractNumId w:val="6"/>
+    <w:abstractNumId w:val="7"/>
   </w:num>
   <w:num w:numId="3" w16cid:durableId="495607043">
-    <w:abstractNumId w:val="7"/>
+    <w:abstractNumId w:val="9"/>
   </w:num>
   <w:num w:numId="4" w16cid:durableId="784808646">
     <w:abstractNumId w:val="1"/>
@@ -10524,13 +11150,19 @@
     <w:abstractNumId w:val="3"/>
   </w:num>
   <w:num w:numId="6" w16cid:durableId="878083777">
-    <w:abstractNumId w:val="5"/>
+    <w:abstractNumId w:val="6"/>
   </w:num>
   <w:num w:numId="7" w16cid:durableId="53621213">
-    <w:abstractNumId w:val="4"/>
+    <w:abstractNumId w:val="5"/>
   </w:num>
   <w:num w:numId="8" w16cid:durableId="956259801">
     <w:abstractNumId w:val="2"/>
+  </w:num>
+  <w:num w:numId="9" w16cid:durableId="1063911861">
+    <w:abstractNumId w:val="4"/>
+  </w:num>
+  <w:num w:numId="10" w16cid:durableId="634603114">
+    <w:abstractNumId w:val="8"/>
   </w:num>
 </w:numbering>
 </file>
@@ -10935,6 +11567,7 @@
   <w:style w:type="paragraph" w:default="1" w:styleId="Normal">
     <w:name w:val="Normal"/>
     <w:qFormat/>
+    <w:rsid w:val="002225E3"/>
   </w:style>
   <w:style w:type="paragraph" w:styleId="Heading1">
     <w:name w:val="heading 1"/>
@@ -11498,6 +12131,18 @@
       <w:shd w:val="clear" w:color="auto" w:fill="E1DFDD"/>
     </w:rPr>
   </w:style>
+  <w:style w:type="character" w:styleId="FollowedHyperlink">
+    <w:name w:val="FollowedHyperlink"/>
+    <w:basedOn w:val="DefaultParagraphFont"/>
+    <w:uiPriority w:val="99"/>
+    <w:semiHidden/>
+    <w:unhideWhenUsed/>
+    <w:rsid w:val="002225E3"/>
+    <w:rPr>
+      <w:color w:val="96607D" w:themeColor="followedHyperlink"/>
+      <w:u w:val="single"/>
+    </w:rPr>
+  </w:style>
 </w:styles>
 </file>
 

</xml_diff>